<commit_message>
Implement Phase 2 ALB and ASG modules with milestone screenshots.
Co-authored-by: Cursor <cursoragent@cursor.com>
</commit_message>
<xml_diff>
--- a/project-2-aws-infrastructure/docs/Milestone-Screenshots/Milestone Screenshots.docx
+++ b/project-2-aws-infrastructure/docs/Milestone-Screenshots/Milestone Screenshots.docx
@@ -29,6 +29,14 @@
     </w:p>
     <w:sdt>
       <w:sdtPr>
+        <w:rPr>
+          <w:rFonts w:asciiTheme="minorHAnsi" w:eastAsiaTheme="minorHAnsi" w:hAnsiTheme="minorHAnsi" w:cstheme="minorBidi"/>
+          <w:color w:val="auto"/>
+          <w:kern w:val="2"/>
+          <w:sz w:val="24"/>
+          <w:szCs w:val="24"/>
+          <w14:ligatures w14:val="standardContextual"/>
+        </w:rPr>
         <w:id w:val="-2117202707"/>
         <w:docPartObj>
           <w:docPartGallery w:val="Table of Contents"/>
@@ -37,15 +45,9 @@
       </w:sdtPr>
       <w:sdtEndPr>
         <w:rPr>
-          <w:rFonts w:asciiTheme="minorHAnsi" w:eastAsiaTheme="minorHAnsi" w:hAnsiTheme="minorHAnsi" w:cstheme="minorBidi"/>
           <w:b/>
           <w:bCs/>
           <w:noProof/>
-          <w:color w:val="auto"/>
-          <w:kern w:val="2"/>
-          <w:sz w:val="24"/>
-          <w:szCs w:val="24"/>
-          <w14:ligatures w14:val="standardContextual"/>
         </w:rPr>
       </w:sdtEndPr>
       <w:sdtContent>
@@ -530,6 +532,9 @@
     <w:p/>
     <w:p>
       <w:r>
+        <w:rPr>
+          <w:noProof/>
+        </w:rPr>
         <w:drawing>
           <wp:inline distT="0" distB="0" distL="0" distR="0" wp14:anchorId="01767693" wp14:editId="38AF94AF">
             <wp:extent cx="4214225" cy="2263336"/>
@@ -569,6 +574,9 @@
     </w:p>
     <w:p>
       <w:r>
+        <w:rPr>
+          <w:noProof/>
+        </w:rPr>
         <w:drawing>
           <wp:inline distT="0" distB="0" distL="0" distR="0" wp14:anchorId="42ABBEDF" wp14:editId="3E2CEED5">
             <wp:extent cx="5943600" cy="1092200"/>
@@ -607,7 +615,17 @@
       </w:r>
     </w:p>
     <w:p>
+      <w:pPr>
+        <w:rPr>
+          <w:noProof/>
+        </w:rPr>
+      </w:pPr>
+    </w:p>
+    <w:p>
       <w:r>
+        <w:rPr>
+          <w:noProof/>
+        </w:rPr>
         <w:lastRenderedPageBreak/>
         <w:drawing>
           <wp:inline distT="0" distB="0" distL="0" distR="0" wp14:anchorId="4E76A5E4" wp14:editId="38C6F152">
@@ -646,9 +664,48 @@
         </w:drawing>
       </w:r>
     </w:p>
+    <w:p>
+      <w:r>
+        <w:drawing>
+          <wp:inline distT="0" distB="0" distL="0" distR="0" wp14:anchorId="511865B0" wp14:editId="3001E3E2">
+            <wp:extent cx="4671465" cy="1501270"/>
+            <wp:effectExtent l="0" t="0" r="0" b="3810"/>
+            <wp:docPr id="1788813894" name="Picture 1"/>
+            <wp:cNvGraphicFramePr>
+              <a:graphicFrameLocks xmlns:a="http://schemas.openxmlformats.org/drawingml/2006/main" noChangeAspect="1"/>
+            </wp:cNvGraphicFramePr>
+            <a:graphic xmlns:a="http://schemas.openxmlformats.org/drawingml/2006/main">
+              <a:graphicData uri="http://schemas.openxmlformats.org/drawingml/2006/picture">
+                <pic:pic xmlns:pic="http://schemas.openxmlformats.org/drawingml/2006/picture">
+                  <pic:nvPicPr>
+                    <pic:cNvPr id="1788813894" name=""/>
+                    <pic:cNvPicPr/>
+                  </pic:nvPicPr>
+                  <pic:blipFill>
+                    <a:blip r:embed="rId11"/>
+                    <a:stretch>
+                      <a:fillRect/>
+                    </a:stretch>
+                  </pic:blipFill>
+                  <pic:spPr>
+                    <a:xfrm>
+                      <a:off x="0" y="0"/>
+                      <a:ext cx="4671465" cy="1501270"/>
+                    </a:xfrm>
+                    <a:prstGeom prst="rect">
+                      <a:avLst/>
+                    </a:prstGeom>
+                  </pic:spPr>
+                </pic:pic>
+              </a:graphicData>
+            </a:graphic>
+          </wp:inline>
+        </w:drawing>
+      </w:r>
+    </w:p>
     <w:p/>
     <w:sectPr>
-      <w:footerReference w:type="default" r:id="rId11"/>
+      <w:footerReference w:type="default" r:id="rId12"/>
       <w:pgSz w:w="12240" w:h="15840"/>
       <w:pgMar w:top="1440" w:right="1440" w:bottom="1440" w:left="1440" w:header="720" w:footer="720" w:gutter="0"/>
       <w:cols w:space="720"/>

</xml_diff>